<commit_message>
Add Astrobites-style hyperlinks to jargon and referenced studies
Link technical terms (ChatGPT, LLM, arXiv, ADS, LaTeX, DOI, Zenodo, JWST, DESI,
Gemini Observatory, GitHub Copilot, PubMed) to explanations, and referenced works
(Gray 2025, Liang 2024, Kobak 2024, Geng & Trotta 2025, the Lancet citation audit,
arXiv/A&A/ESO policies) to sources. Renderers now emit real hyperlinks in both docx and pdf.

Co-Authored-By: Claude Opus 4.8 <noreply@anthropic.com>
</commit_message>
<xml_diff>
--- a/POST.docx
+++ b/POST.docx
@@ -49,7 +49,32 @@
           <w:sz w:val="22"/>
           <w:szCs w:val="22"/>
         </w:rPr>
-        <w:t xml:space="preserve">Ask an early version of ChatGPT to polish a paragraph and the same handful of words keeps coming back, words like </w:t>
+        <w:t xml:space="preserve">Ask an early version of </w:t>
+      </w:r>
+      <w:hyperlink w:history="1" r:id="rIdivdqovpcox6ozzyguyenz">
+        <w:r>
+          <w:rPr>
+            <w:rFonts w:ascii="DejaVu Serif" w:cs="DejaVu Serif" w:eastAsia="DejaVu Serif" w:hAnsi="DejaVu Serif"/>
+            <w:i w:val="false"/>
+            <w:iCs w:val="false"/>
+            <w:color w:val="0563C1"/>
+            <w:sz w:val="22"/>
+            <w:szCs w:val="22"/>
+            <w:u w:val="single"/>
+          </w:rPr>
+          <w:t xml:space="preserve">ChatGPT</w:t>
+        </w:r>
+      </w:hyperlink>
+      <w:r>
+        <w:rPr>
+          <w:rFonts w:ascii="DejaVu Serif" w:cs="DejaVu Serif" w:eastAsia="DejaVu Serif" w:hAnsi="DejaVu Serif"/>
+          <w:i w:val="false"/>
+          <w:iCs w:val="false"/>
+          <w:color w:val="1A1A1A"/>
+          <w:sz w:val="22"/>
+          <w:szCs w:val="22"/>
+        </w:rPr>
+        <w:t xml:space="preserve"> to polish a paragraph and the same handful of words keeps coming back, words like </w:t>
       </w:r>
       <w:r>
         <w:rPr>
@@ -154,24 +179,174 @@
           <w:sz w:val="22"/>
           <w:szCs w:val="22"/>
         </w:rPr>
-        <w:t xml:space="preserve">Other fields have already put a number on this. One study estimates that a large language model (a text-prediction system trained on huge amounts of writing, ChatGPT being the best-known example) was involved in more than 10% of all papers published in 2024. In computer science the fraction of abstracts with model-edited text has been put near 17%. For biomedical papers on PubMed, the estimate is at least 13.5%. Nobody has published the number for astronomy. So, I set out to measure it.</w:t>
-      </w:r>
-    </w:p>
-    <w:p>
-      <w:pPr>
-        <w:spacing w:after="120" w:line="276"/>
-        <w:jc w:val="both"/>
-      </w:pPr>
-      <w:r>
-        <w:rPr>
-          <w:rFonts w:ascii="DejaVu Serif" w:cs="DejaVu Serif" w:eastAsia="DejaVu Serif" w:hAnsi="DejaVu Serif"/>
-          <w:i w:val="false"/>
-          <w:iCs w:val="false"/>
-          <w:color w:val="1A1A1A"/>
-          <w:sz w:val="22"/>
-          <w:szCs w:val="22"/>
-        </w:rPr>
-        <w:t xml:space="preserve">I pulled the abstracts of every astro-ph paper posted to arXiv from January 2015 through mid-2026, which comes to 200,547 papers. Then I counted words. This post walks through what the counting shows, where it stops working, and one place where astronomy comes out looking better than most fields.</w:t>
+        <w:t xml:space="preserve">Other fields have already put a number on this. </w:t>
+      </w:r>
+      <w:hyperlink w:history="1" r:id="rId1hehov8mbceurv2sev9uq">
+        <w:r>
+          <w:rPr>
+            <w:rFonts w:ascii="DejaVu Serif" w:cs="DejaVu Serif" w:eastAsia="DejaVu Serif" w:hAnsi="DejaVu Serif"/>
+            <w:i w:val="false"/>
+            <w:iCs w:val="false"/>
+            <w:color w:val="0563C1"/>
+            <w:sz w:val="22"/>
+            <w:szCs w:val="22"/>
+            <w:u w:val="single"/>
+          </w:rPr>
+          <w:t xml:space="preserve">One study</w:t>
+        </w:r>
+      </w:hyperlink>
+      <w:r>
+        <w:rPr>
+          <w:rFonts w:ascii="DejaVu Serif" w:cs="DejaVu Serif" w:eastAsia="DejaVu Serif" w:hAnsi="DejaVu Serif"/>
+          <w:i w:val="false"/>
+          <w:iCs w:val="false"/>
+          <w:color w:val="1A1A1A"/>
+          <w:sz w:val="22"/>
+          <w:szCs w:val="22"/>
+        </w:rPr>
+        <w:t xml:space="preserve"> estimates that a </w:t>
+      </w:r>
+      <w:hyperlink w:history="1" r:id="rIdvxkwxlyb7hrmwwkdob4jj">
+        <w:r>
+          <w:rPr>
+            <w:rFonts w:ascii="DejaVu Serif" w:cs="DejaVu Serif" w:eastAsia="DejaVu Serif" w:hAnsi="DejaVu Serif"/>
+            <w:i w:val="false"/>
+            <w:iCs w:val="false"/>
+            <w:color w:val="0563C1"/>
+            <w:sz w:val="22"/>
+            <w:szCs w:val="22"/>
+            <w:u w:val="single"/>
+          </w:rPr>
+          <w:t xml:space="preserve">large language model</w:t>
+        </w:r>
+      </w:hyperlink>
+      <w:r>
+        <w:rPr>
+          <w:rFonts w:ascii="DejaVu Serif" w:cs="DejaVu Serif" w:eastAsia="DejaVu Serif" w:hAnsi="DejaVu Serif"/>
+          <w:i w:val="false"/>
+          <w:iCs w:val="false"/>
+          <w:color w:val="1A1A1A"/>
+          <w:sz w:val="22"/>
+          <w:szCs w:val="22"/>
+        </w:rPr>
+        <w:t xml:space="preserve"> (a text-prediction system trained on huge amounts of writing, ChatGPT being the best-known example) was involved in more than 10% of all papers published in 2024. In computer science the fraction of abstracts with model-edited text has been put </w:t>
+      </w:r>
+      <w:hyperlink w:history="1" r:id="rIdceyylr-bf4mylfovby1gv">
+        <w:r>
+          <w:rPr>
+            <w:rFonts w:ascii="DejaVu Serif" w:cs="DejaVu Serif" w:eastAsia="DejaVu Serif" w:hAnsi="DejaVu Serif"/>
+            <w:i w:val="false"/>
+            <w:iCs w:val="false"/>
+            <w:color w:val="0563C1"/>
+            <w:sz w:val="22"/>
+            <w:szCs w:val="22"/>
+            <w:u w:val="single"/>
+          </w:rPr>
+          <w:t xml:space="preserve">near 17%</w:t>
+        </w:r>
+      </w:hyperlink>
+      <w:r>
+        <w:rPr>
+          <w:rFonts w:ascii="DejaVu Serif" w:cs="DejaVu Serif" w:eastAsia="DejaVu Serif" w:hAnsi="DejaVu Serif"/>
+          <w:i w:val="false"/>
+          <w:iCs w:val="false"/>
+          <w:color w:val="1A1A1A"/>
+          <w:sz w:val="22"/>
+          <w:szCs w:val="22"/>
+        </w:rPr>
+        <w:t xml:space="preserve">. For biomedical papers on </w:t>
+      </w:r>
+      <w:hyperlink w:history="1" r:id="rIdjslvjsrfgerhxolakzekt">
+        <w:r>
+          <w:rPr>
+            <w:rFonts w:ascii="DejaVu Serif" w:cs="DejaVu Serif" w:eastAsia="DejaVu Serif" w:hAnsi="DejaVu Serif"/>
+            <w:i w:val="false"/>
+            <w:iCs w:val="false"/>
+            <w:color w:val="0563C1"/>
+            <w:sz w:val="22"/>
+            <w:szCs w:val="22"/>
+            <w:u w:val="single"/>
+          </w:rPr>
+          <w:t xml:space="preserve">PubMed</w:t>
+        </w:r>
+      </w:hyperlink>
+      <w:r>
+        <w:rPr>
+          <w:rFonts w:ascii="DejaVu Serif" w:cs="DejaVu Serif" w:eastAsia="DejaVu Serif" w:hAnsi="DejaVu Serif"/>
+          <w:i w:val="false"/>
+          <w:iCs w:val="false"/>
+          <w:color w:val="1A1A1A"/>
+          <w:sz w:val="22"/>
+          <w:szCs w:val="22"/>
+        </w:rPr>
+        <w:t xml:space="preserve">, the estimate is at least </w:t>
+      </w:r>
+      <w:hyperlink w:history="1" r:id="rIddzbmsscnesghkxjssltrs">
+        <w:r>
+          <w:rPr>
+            <w:rFonts w:ascii="DejaVu Serif" w:cs="DejaVu Serif" w:eastAsia="DejaVu Serif" w:hAnsi="DejaVu Serif"/>
+            <w:i w:val="false"/>
+            <w:iCs w:val="false"/>
+            <w:color w:val="0563C1"/>
+            <w:sz w:val="22"/>
+            <w:szCs w:val="22"/>
+            <w:u w:val="single"/>
+          </w:rPr>
+          <w:t xml:space="preserve">13.5%</w:t>
+        </w:r>
+      </w:hyperlink>
+      <w:r>
+        <w:rPr>
+          <w:rFonts w:ascii="DejaVu Serif" w:cs="DejaVu Serif" w:eastAsia="DejaVu Serif" w:hAnsi="DejaVu Serif"/>
+          <w:i w:val="false"/>
+          <w:iCs w:val="false"/>
+          <w:color w:val="1A1A1A"/>
+          <w:sz w:val="22"/>
+          <w:szCs w:val="22"/>
+        </w:rPr>
+        <w:t xml:space="preserve">. Nobody has published the number for astronomy. So, I set out to measure it.</w:t>
+      </w:r>
+    </w:p>
+    <w:p>
+      <w:pPr>
+        <w:spacing w:after="120" w:line="276"/>
+        <w:jc w:val="both"/>
+      </w:pPr>
+      <w:r>
+        <w:rPr>
+          <w:rFonts w:ascii="DejaVu Serif" w:cs="DejaVu Serif" w:eastAsia="DejaVu Serif" w:hAnsi="DejaVu Serif"/>
+          <w:i w:val="false"/>
+          <w:iCs w:val="false"/>
+          <w:color w:val="1A1A1A"/>
+          <w:sz w:val="22"/>
+          <w:szCs w:val="22"/>
+        </w:rPr>
+        <w:t xml:space="preserve">I pulled the abstracts of every astro-ph paper posted to </w:t>
+      </w:r>
+      <w:hyperlink w:history="1" r:id="rIduw9okjswo0vnnnqq9evc4">
+        <w:r>
+          <w:rPr>
+            <w:rFonts w:ascii="DejaVu Serif" w:cs="DejaVu Serif" w:eastAsia="DejaVu Serif" w:hAnsi="DejaVu Serif"/>
+            <w:i w:val="false"/>
+            <w:iCs w:val="false"/>
+            <w:color w:val="0563C1"/>
+            <w:sz w:val="22"/>
+            <w:szCs w:val="22"/>
+            <w:u w:val="single"/>
+          </w:rPr>
+          <w:t xml:space="preserve">arXiv</w:t>
+        </w:r>
+      </w:hyperlink>
+      <w:r>
+        <w:rPr>
+          <w:rFonts w:ascii="DejaVu Serif" w:cs="DejaVu Serif" w:eastAsia="DejaVu Serif" w:hAnsi="DejaVu Serif"/>
+          <w:i w:val="false"/>
+          <w:iCs w:val="false"/>
+          <w:color w:val="1A1A1A"/>
+          <w:sz w:val="22"/>
+          <w:szCs w:val="22"/>
+        </w:rPr>
+        <w:t xml:space="preserve"> from January 2015 through mid-2026, which comes to 200,547 papers. Then I counted words. This post walks through what the counting shows, where it stops working, and one place where astronomy comes out looking better than most fields.</w:t>
       </w:r>
     </w:p>
     <w:p>
@@ -656,7 +831,32 @@
           <w:sz w:val="22"/>
           <w:szCs w:val="22"/>
         </w:rPr>
-        <w:t xml:space="preserve"> was known, it went away. Authors, and the tools themselves, stopped using it. But the top panel shows that the overall marker rate did not fall with it. Other words took over the load. Earlier work found the same pattern across all of arXiv, and astronomy follows it closely.</w:t>
+        <w:t xml:space="preserve"> was known, it went away. Authors, and the tools themselves, stopped using it. But the top panel shows that the overall marker rate did not fall with it. Other words took over the load. </w:t>
+      </w:r>
+      <w:hyperlink w:history="1" r:id="rIdxnlhdwv_ytd31tgzsx8fn">
+        <w:r>
+          <w:rPr>
+            <w:rFonts w:ascii="DejaVu Serif" w:cs="DejaVu Serif" w:eastAsia="DejaVu Serif" w:hAnsi="DejaVu Serif"/>
+            <w:i w:val="false"/>
+            <w:iCs w:val="false"/>
+            <w:color w:val="0563C1"/>
+            <w:sz w:val="22"/>
+            <w:szCs w:val="22"/>
+            <w:u w:val="single"/>
+          </w:rPr>
+          <w:t xml:space="preserve">Earlier work</w:t>
+        </w:r>
+      </w:hyperlink>
+      <w:r>
+        <w:rPr>
+          <w:rFonts w:ascii="DejaVu Serif" w:cs="DejaVu Serif" w:eastAsia="DejaVu Serif" w:hAnsi="DejaVu Serif"/>
+          <w:i w:val="false"/>
+          <w:iCs w:val="false"/>
+          <w:color w:val="1A1A1A"/>
+          <w:sz w:val="22"/>
+          <w:szCs w:val="22"/>
+        </w:rPr>
+        <w:t xml:space="preserve"> found the same pattern across all of arXiv, and astronomy follows it closely.</w:t>
       </w:r>
     </w:p>
     <w:p>
@@ -752,7 +952,57 @@
           <w:sz w:val="18"/>
           <w:szCs w:val="18"/>
         </w:rPr>
-        <w:t xml:space="preserve">Figure 3: The words whose frequency rose the most in astro-ph, ranked by ratio. They split into two groups. Blue words are new telescopes and surveys (JWST's NIRCam, MIRI, NIRSpec, the DESI survey), real astronomy events. Red words are chatbot-style verbs and adjectives (leveraging, pivotal, intricate, highlighting).</w:t>
+        <w:t xml:space="preserve">Figure 3: The words whose frequency rose the most in astro-ph, ranked by ratio. They split into two groups. Blue words are new telescopes and surveys (</w:t>
+      </w:r>
+      <w:hyperlink w:history="1" r:id="rIdevar_iiws_5lf6cnkvj8h">
+        <w:r>
+          <w:rPr>
+            <w:rFonts w:ascii="DejaVu Serif" w:cs="DejaVu Serif" w:eastAsia="DejaVu Serif" w:hAnsi="DejaVu Serif"/>
+            <w:i/>
+            <w:iCs/>
+            <w:color w:val="0563C1"/>
+            <w:sz w:val="18"/>
+            <w:szCs w:val="18"/>
+            <w:u w:val="single"/>
+          </w:rPr>
+          <w:t xml:space="preserve">JWST</w:t>
+        </w:r>
+      </w:hyperlink>
+      <w:r>
+        <w:rPr>
+          <w:rFonts w:ascii="DejaVu Serif" w:cs="DejaVu Serif" w:eastAsia="DejaVu Serif" w:hAnsi="DejaVu Serif"/>
+          <w:i/>
+          <w:iCs/>
+          <w:color w:val="1A1A1A"/>
+          <w:sz w:val="18"/>
+          <w:szCs w:val="18"/>
+        </w:rPr>
+        <w:t xml:space="preserve">'s NIRCam, MIRI, NIRSpec, the </w:t>
+      </w:r>
+      <w:hyperlink w:history="1" r:id="rIdjzqchdwo_t8ukofn0eetl">
+        <w:r>
+          <w:rPr>
+            <w:rFonts w:ascii="DejaVu Serif" w:cs="DejaVu Serif" w:eastAsia="DejaVu Serif" w:hAnsi="DejaVu Serif"/>
+            <w:i/>
+            <w:iCs/>
+            <w:color w:val="0563C1"/>
+            <w:sz w:val="18"/>
+            <w:szCs w:val="18"/>
+            <w:u w:val="single"/>
+          </w:rPr>
+          <w:t xml:space="preserve">DESI survey</w:t>
+        </w:r>
+      </w:hyperlink>
+      <w:r>
+        <w:rPr>
+          <w:rFonts w:ascii="DejaVu Serif" w:cs="DejaVu Serif" w:eastAsia="DejaVu Serif" w:hAnsi="DejaVu Serif"/>
+          <w:i/>
+          <w:iCs/>
+          <w:color w:val="1A1A1A"/>
+          <w:sz w:val="18"/>
+          <w:szCs w:val="18"/>
+        </w:rPr>
+        <w:t xml:space="preserve">), real astronomy events. Red words are chatbot-style verbs and adjectives (leveraging, pivotal, intricate, highlighting).</w:t>
       </w:r>
     </w:p>
     <w:p>
@@ -932,7 +1182,82 @@
           <w:sz w:val="22"/>
           <w:szCs w:val="22"/>
         </w:rPr>
-        <w:t xml:space="preserve">If a few percent of abstracts have chatbot help, how many authors mention it? NASA ADS lets you search the acknowledgments section of papers, which is where people note the tools they used. I searched astronomy papers each year for clear terms: ChatGPT, GPT-4, "large language model", GitHub Copilot. I left out words like "Gemini", which in astronomy usually means the Gemini Observatory, and "Claude", which is often a person's name.</w:t>
+        <w:t xml:space="preserve">If a few percent of abstracts have chatbot help, how many authors mention it? </w:t>
+      </w:r>
+      <w:hyperlink w:history="1" r:id="rIdticpfzlrlbrz63fb5daaa">
+        <w:r>
+          <w:rPr>
+            <w:rFonts w:ascii="DejaVu Serif" w:cs="DejaVu Serif" w:eastAsia="DejaVu Serif" w:hAnsi="DejaVu Serif"/>
+            <w:i w:val="false"/>
+            <w:iCs w:val="false"/>
+            <w:color w:val="0563C1"/>
+            <w:sz w:val="22"/>
+            <w:szCs w:val="22"/>
+            <w:u w:val="single"/>
+          </w:rPr>
+          <w:t xml:space="preserve">NASA ADS</w:t>
+        </w:r>
+      </w:hyperlink>
+      <w:r>
+        <w:rPr>
+          <w:rFonts w:ascii="DejaVu Serif" w:cs="DejaVu Serif" w:eastAsia="DejaVu Serif" w:hAnsi="DejaVu Serif"/>
+          <w:i w:val="false"/>
+          <w:iCs w:val="false"/>
+          <w:color w:val="1A1A1A"/>
+          <w:sz w:val="22"/>
+          <w:szCs w:val="22"/>
+        </w:rPr>
+        <w:t xml:space="preserve"> lets you search the acknowledgments section of papers, which is where people note the tools they used. I searched astronomy papers each year for clear terms: ChatGPT, GPT-4, "large language model", </w:t>
+      </w:r>
+      <w:hyperlink w:history="1" r:id="rIdy88cxmsq_ci6yenrfnwfb">
+        <w:r>
+          <w:rPr>
+            <w:rFonts w:ascii="DejaVu Serif" w:cs="DejaVu Serif" w:eastAsia="DejaVu Serif" w:hAnsi="DejaVu Serif"/>
+            <w:i w:val="false"/>
+            <w:iCs w:val="false"/>
+            <w:color w:val="0563C1"/>
+            <w:sz w:val="22"/>
+            <w:szCs w:val="22"/>
+            <w:u w:val="single"/>
+          </w:rPr>
+          <w:t xml:space="preserve">GitHub Copilot</w:t>
+        </w:r>
+      </w:hyperlink>
+      <w:r>
+        <w:rPr>
+          <w:rFonts w:ascii="DejaVu Serif" w:cs="DejaVu Serif" w:eastAsia="DejaVu Serif" w:hAnsi="DejaVu Serif"/>
+          <w:i w:val="false"/>
+          <w:iCs w:val="false"/>
+          <w:color w:val="1A1A1A"/>
+          <w:sz w:val="22"/>
+          <w:szCs w:val="22"/>
+        </w:rPr>
+        <w:t xml:space="preserve">. I left out words like "Gemini", which in astronomy usually means the </w:t>
+      </w:r>
+      <w:hyperlink w:history="1" r:id="rIdcpup1iti2-ahhdwfdrres">
+        <w:r>
+          <w:rPr>
+            <w:rFonts w:ascii="DejaVu Serif" w:cs="DejaVu Serif" w:eastAsia="DejaVu Serif" w:hAnsi="DejaVu Serif"/>
+            <w:i w:val="false"/>
+            <w:iCs w:val="false"/>
+            <w:color w:val="0563C1"/>
+            <w:sz w:val="22"/>
+            <w:szCs w:val="22"/>
+            <w:u w:val="single"/>
+          </w:rPr>
+          <w:t xml:space="preserve">Gemini Observatory</w:t>
+        </w:r>
+      </w:hyperlink>
+      <w:r>
+        <w:rPr>
+          <w:rFonts w:ascii="DejaVu Serif" w:cs="DejaVu Serif" w:eastAsia="DejaVu Serif" w:hAnsi="DejaVu Serif"/>
+          <w:i w:val="false"/>
+          <w:iCs w:val="false"/>
+          <w:color w:val="1A1A1A"/>
+          <w:sz w:val="22"/>
+          <w:szCs w:val="22"/>
+        </w:rPr>
+        <w:t xml:space="preserve">, and "Claude", which is often a person's name.</w:t>
       </w:r>
     </w:p>
     <w:p>
@@ -1045,7 +1370,32 @@
           <w:sz w:val="22"/>
           <w:szCs w:val="22"/>
         </w:rPr>
-        <w:t xml:space="preserve">I tried one more thing. arXiv posts the LaTeX source of most papers, not just the final PDF. Sometimes a chatbot's boilerplate gets pasted into that source and left in a comment that never shows up in the PDF, lines like "as an AI language model". I downloaded the source of 3,950 papers and searched for these leftovers.</w:t>
+        <w:t xml:space="preserve">I tried one more thing. arXiv posts the </w:t>
+      </w:r>
+      <w:hyperlink w:history="1" r:id="rIdr4_a6eys6-xbp-tp32qdf">
+        <w:r>
+          <w:rPr>
+            <w:rFonts w:ascii="DejaVu Serif" w:cs="DejaVu Serif" w:eastAsia="DejaVu Serif" w:hAnsi="DejaVu Serif"/>
+            <w:i w:val="false"/>
+            <w:iCs w:val="false"/>
+            <w:color w:val="0563C1"/>
+            <w:sz w:val="22"/>
+            <w:szCs w:val="22"/>
+            <w:u w:val="single"/>
+          </w:rPr>
+          <w:t xml:space="preserve">LaTeX</w:t>
+        </w:r>
+      </w:hyperlink>
+      <w:r>
+        <w:rPr>
+          <w:rFonts w:ascii="DejaVu Serif" w:cs="DejaVu Serif" w:eastAsia="DejaVu Serif" w:hAnsi="DejaVu Serif"/>
+          <w:i w:val="false"/>
+          <w:iCs w:val="false"/>
+          <w:color w:val="1A1A1A"/>
+          <w:sz w:val="22"/>
+          <w:szCs w:val="22"/>
+        </w:rPr>
+        <w:t xml:space="preserve"> source of most papers, not just the final PDF. Sometimes a chatbot's boilerplate gets pasted into that source and left in a comment that never shows up in the PDF, lines like "as an AI language model". I downloaded the source of 3,950 papers and searched for these leftovers.</w:t>
       </w:r>
     </w:p>
     <w:p>
@@ -1175,24 +1525,99 @@
           <w:sz w:val="22"/>
           <w:szCs w:val="22"/>
         </w:rPr>
-        <w:t xml:space="preserve">There is a real worry in other fields that chatbots invent references, citations to papers that do not exist. A recent audit of medical papers found the rate of made-up citations rising, reaching roughly one paper in 458 by 2025. Astronomy has a tool that should guard against this: the NASA Astrophysics Data System, which nearly every astronomer uses to build their reference lists, so the identifiers are real by construction.</w:t>
-      </w:r>
-    </w:p>
-    <w:p>
-      <w:pPr>
-        <w:spacing w:after="120" w:line="276"/>
-        <w:jc w:val="both"/>
-      </w:pPr>
-      <w:r>
-        <w:rPr>
-          <w:rFonts w:ascii="DejaVu Serif" w:cs="DejaVu Serif" w:eastAsia="DejaVu Serif" w:hAnsi="DejaVu Serif"/>
-          <w:i w:val="false"/>
-          <w:iCs w:val="false"/>
-          <w:color w:val="1A1A1A"/>
-          <w:sz w:val="22"/>
-          <w:szCs w:val="22"/>
-        </w:rPr>
-        <w:t xml:space="preserve">I checked. From the source of recent papers, I pulled about 6,460 cited arXiv identifiers and 2,500 cited DOIs (a DOI is a permanent code that points to a specific paper or dataset). Then I looked up whether each one exists.</w:t>
+        <w:t xml:space="preserve">There is a real worry in other fields that chatbots invent references, citations to papers that do not exist. </w:t>
+      </w:r>
+      <w:hyperlink w:history="1" r:id="rIddc6wz3jt63gkfuqvmv9sl">
+        <w:r>
+          <w:rPr>
+            <w:rFonts w:ascii="DejaVu Serif" w:cs="DejaVu Serif" w:eastAsia="DejaVu Serif" w:hAnsi="DejaVu Serif"/>
+            <w:i w:val="false"/>
+            <w:iCs w:val="false"/>
+            <w:color w:val="0563C1"/>
+            <w:sz w:val="22"/>
+            <w:szCs w:val="22"/>
+            <w:u w:val="single"/>
+          </w:rPr>
+          <w:t xml:space="preserve">A recent audit of medical papers</w:t>
+        </w:r>
+      </w:hyperlink>
+      <w:r>
+        <w:rPr>
+          <w:rFonts w:ascii="DejaVu Serif" w:cs="DejaVu Serif" w:eastAsia="DejaVu Serif" w:hAnsi="DejaVu Serif"/>
+          <w:i w:val="false"/>
+          <w:iCs w:val="false"/>
+          <w:color w:val="1A1A1A"/>
+          <w:sz w:val="22"/>
+          <w:szCs w:val="22"/>
+        </w:rPr>
+        <w:t xml:space="preserve"> found the rate of made-up citations rising, reaching roughly one paper in 458 by 2025. Astronomy has a tool that should guard against this: the </w:t>
+      </w:r>
+      <w:hyperlink w:history="1" r:id="rId1u2dy8688absf-sxi6yw6">
+        <w:r>
+          <w:rPr>
+            <w:rFonts w:ascii="DejaVu Serif" w:cs="DejaVu Serif" w:eastAsia="DejaVu Serif" w:hAnsi="DejaVu Serif"/>
+            <w:i w:val="false"/>
+            <w:iCs w:val="false"/>
+            <w:color w:val="0563C1"/>
+            <w:sz w:val="22"/>
+            <w:szCs w:val="22"/>
+            <w:u w:val="single"/>
+          </w:rPr>
+          <w:t xml:space="preserve">NASA Astrophysics Data System</w:t>
+        </w:r>
+      </w:hyperlink>
+      <w:r>
+        <w:rPr>
+          <w:rFonts w:ascii="DejaVu Serif" w:cs="DejaVu Serif" w:eastAsia="DejaVu Serif" w:hAnsi="DejaVu Serif"/>
+          <w:i w:val="false"/>
+          <w:iCs w:val="false"/>
+          <w:color w:val="1A1A1A"/>
+          <w:sz w:val="22"/>
+          <w:szCs w:val="22"/>
+        </w:rPr>
+        <w:t xml:space="preserve">, which nearly every astronomer uses to build their reference lists, so the identifiers are real by construction.</w:t>
+      </w:r>
+    </w:p>
+    <w:p>
+      <w:pPr>
+        <w:spacing w:after="120" w:line="276"/>
+        <w:jc w:val="both"/>
+      </w:pPr>
+      <w:r>
+        <w:rPr>
+          <w:rFonts w:ascii="DejaVu Serif" w:cs="DejaVu Serif" w:eastAsia="DejaVu Serif" w:hAnsi="DejaVu Serif"/>
+          <w:i w:val="false"/>
+          <w:iCs w:val="false"/>
+          <w:color w:val="1A1A1A"/>
+          <w:sz w:val="22"/>
+          <w:szCs w:val="22"/>
+        </w:rPr>
+        <w:t xml:space="preserve">I checked. From the source of recent papers, I pulled about 6,460 cited arXiv identifiers and 2,500 cited </w:t>
+      </w:r>
+      <w:hyperlink w:history="1" r:id="rIdrigxo0vwaguh0fuubt409">
+        <w:r>
+          <w:rPr>
+            <w:rFonts w:ascii="DejaVu Serif" w:cs="DejaVu Serif" w:eastAsia="DejaVu Serif" w:hAnsi="DejaVu Serif"/>
+            <w:i w:val="false"/>
+            <w:iCs w:val="false"/>
+            <w:color w:val="0563C1"/>
+            <w:sz w:val="22"/>
+            <w:szCs w:val="22"/>
+            <w:u w:val="single"/>
+          </w:rPr>
+          <w:t xml:space="preserve">DOIs</w:t>
+        </w:r>
+      </w:hyperlink>
+      <w:r>
+        <w:rPr>
+          <w:rFonts w:ascii="DejaVu Serif" w:cs="DejaVu Serif" w:eastAsia="DejaVu Serif" w:hAnsi="DejaVu Serif"/>
+          <w:i w:val="false"/>
+          <w:iCs w:val="false"/>
+          <w:color w:val="1A1A1A"/>
+          <w:sz w:val="22"/>
+          <w:szCs w:val="22"/>
+        </w:rPr>
+        <w:t xml:space="preserve"> (a DOI is a permanent code that points to a specific paper or dataset). Then I looked up whether each one exists.</w:t>
       </w:r>
     </w:p>
     <w:p>
@@ -1272,7 +1697,32 @@
           <w:sz w:val="22"/>
           <w:szCs w:val="22"/>
         </w:rPr>
-        <w:t xml:space="preserve">Every one of the 6,460 arXiv identifiers exists. Of the DOIs, the ones a first pass could not find turned out to be real records held in registries that the checking service does not index, such as arXiv's own system and the Zenodo archive. After sorting those out, the count of invented citations is zero. Astronomy's habit of building reference lists from ADS seems to protect it from a problem that is growing elsewhere.</w:t>
+        <w:t xml:space="preserve">Every one of the 6,460 arXiv identifiers exists. Of the DOIs, the ones a first pass could not find turned out to be real records held in registries that the checking service does not index, such as arXiv's own system and the </w:t>
+      </w:r>
+      <w:hyperlink w:history="1" r:id="rIdpgbad8w1ooj-azydnydsq">
+        <w:r>
+          <w:rPr>
+            <w:rFonts w:ascii="DejaVu Serif" w:cs="DejaVu Serif" w:eastAsia="DejaVu Serif" w:hAnsi="DejaVu Serif"/>
+            <w:i w:val="false"/>
+            <w:iCs w:val="false"/>
+            <w:color w:val="0563C1"/>
+            <w:sz w:val="22"/>
+            <w:szCs w:val="22"/>
+            <w:u w:val="single"/>
+          </w:rPr>
+          <w:t xml:space="preserve">Zenodo</w:t>
+        </w:r>
+      </w:hyperlink>
+      <w:r>
+        <w:rPr>
+          <w:rFonts w:ascii="DejaVu Serif" w:cs="DejaVu Serif" w:eastAsia="DejaVu Serif" w:hAnsi="DejaVu Serif"/>
+          <w:i w:val="false"/>
+          <w:iCs w:val="false"/>
+          <w:color w:val="1A1A1A"/>
+          <w:sz w:val="22"/>
+          <w:szCs w:val="22"/>
+        </w:rPr>
+        <w:t xml:space="preserve"> archive. After sorting those out, the count of invented citations is zero. Astronomy's habit of building reference lists from ADS seems to protect it from a problem that is growing elsewhere.</w:t>
       </w:r>
     </w:p>
     <w:p>
@@ -1890,7 +2340,82 @@
           <w:sz w:val="22"/>
           <w:szCs w:val="22"/>
         </w:rPr>
-        <w:t xml:space="preserve">On policy, the picture is uneven. arXiv asks authors to note significant use of generative tools and does not allow a tool to be listed as an author. Observatory time-allocation rules, such as those at ESO, forbid using a chatbot to judge a proposal. Astronomy and Astrophysics put out a statement on AI-assisted writing in mid-2026. A clear, dated policy from the AAS journals is harder to find written down in one place. The open question is whether astronomy should agree on a disclosure norm now, before any single case forces the issue.</w:t>
+        <w:t xml:space="preserve">On policy, the picture is uneven. arXiv asks authors to </w:t>
+      </w:r>
+      <w:hyperlink w:history="1" r:id="rIdug7vdylqe95ws3og6vefy">
+        <w:r>
+          <w:rPr>
+            <w:rFonts w:ascii="DejaVu Serif" w:cs="DejaVu Serif" w:eastAsia="DejaVu Serif" w:hAnsi="DejaVu Serif"/>
+            <w:i w:val="false"/>
+            <w:iCs w:val="false"/>
+            <w:color w:val="0563C1"/>
+            <w:sz w:val="22"/>
+            <w:szCs w:val="22"/>
+            <w:u w:val="single"/>
+          </w:rPr>
+          <w:t xml:space="preserve">note significant use of generative tools</w:t>
+        </w:r>
+      </w:hyperlink>
+      <w:r>
+        <w:rPr>
+          <w:rFonts w:ascii="DejaVu Serif" w:cs="DejaVu Serif" w:eastAsia="DejaVu Serif" w:hAnsi="DejaVu Serif"/>
+          <w:i w:val="false"/>
+          <w:iCs w:val="false"/>
+          <w:color w:val="1A1A1A"/>
+          <w:sz w:val="22"/>
+          <w:szCs w:val="22"/>
+        </w:rPr>
+        <w:t xml:space="preserve"> and does not allow a tool to be listed as an author. Observatory time-allocation rules, such as those at </w:t>
+      </w:r>
+      <w:hyperlink w:history="1" r:id="rIdhtdr-3tyrju8etyup9fgl">
+        <w:r>
+          <w:rPr>
+            <w:rFonts w:ascii="DejaVu Serif" w:cs="DejaVu Serif" w:eastAsia="DejaVu Serif" w:hAnsi="DejaVu Serif"/>
+            <w:i w:val="false"/>
+            <w:iCs w:val="false"/>
+            <w:color w:val="0563C1"/>
+            <w:sz w:val="22"/>
+            <w:szCs w:val="22"/>
+            <w:u w:val="single"/>
+          </w:rPr>
+          <w:t xml:space="preserve">ESO</w:t>
+        </w:r>
+      </w:hyperlink>
+      <w:r>
+        <w:rPr>
+          <w:rFonts w:ascii="DejaVu Serif" w:cs="DejaVu Serif" w:eastAsia="DejaVu Serif" w:hAnsi="DejaVu Serif"/>
+          <w:i w:val="false"/>
+          <w:iCs w:val="false"/>
+          <w:color w:val="1A1A1A"/>
+          <w:sz w:val="22"/>
+          <w:szCs w:val="22"/>
+        </w:rPr>
+        <w:t xml:space="preserve">, forbid using a chatbot to judge a proposal. Astronomy and Astrophysics put out a </w:t>
+      </w:r>
+      <w:hyperlink w:history="1" r:id="rIdym4i6im_omsq9hhooqeu9">
+        <w:r>
+          <w:rPr>
+            <w:rFonts w:ascii="DejaVu Serif" w:cs="DejaVu Serif" w:eastAsia="DejaVu Serif" w:hAnsi="DejaVu Serif"/>
+            <w:i w:val="false"/>
+            <w:iCs w:val="false"/>
+            <w:color w:val="0563C1"/>
+            <w:sz w:val="22"/>
+            <w:szCs w:val="22"/>
+            <w:u w:val="single"/>
+          </w:rPr>
+          <w:t xml:space="preserve">statement on AI-assisted writing</w:t>
+        </w:r>
+      </w:hyperlink>
+      <w:r>
+        <w:rPr>
+          <w:rFonts w:ascii="DejaVu Serif" w:cs="DejaVu Serif" w:eastAsia="DejaVu Serif" w:hAnsi="DejaVu Serif"/>
+          <w:i w:val="false"/>
+          <w:iCs w:val="false"/>
+          <w:color w:val="1A1A1A"/>
+          <w:sz w:val="22"/>
+          <w:szCs w:val="22"/>
+        </w:rPr>
+        <w:t xml:space="preserve"> in mid-2026. A clear, dated policy from the AAS journals is harder to find written down in one place. The open question is whether astronomy should agree on a disclosure norm now, before any single case forces the issue.</w:t>
       </w:r>
     </w:p>
     <w:p>
@@ -1923,7 +2448,57 @@
           <w:sz w:val="22"/>
           <w:szCs w:val="22"/>
         </w:rPr>
-        <w:t xml:space="preserve">Given the subject, it is only fair to say how this post was made. I used Claude Code to gather the data, write the counting code, and draft the figures. I checked the numbers against the public arXiv and ADS records. The code and the derived data are on GitHub at [github.com/seratsaad/llm-in-astro-ph](https://github.com/seratsaad/llm-in-astro-ph), with instructions so anyone can repeat the counts or rebuild the figures. Some of the tools this work builds on, including the astro-ph knowledge graph, are shared by Yuan-Sen Ting at [github.com/tingyuansen](https://github.com/tingyuansen). The words here are my own. It is harder than it sounds, which is part of the point.</w:t>
+        <w:t xml:space="preserve">Given the subject, it is only fair to say how this post was made. I used Claude Code to gather the data, write the counting code, and draft the figures. I checked the numbers against the public arXiv and ADS records. The code and the derived data are on GitHub at </w:t>
+      </w:r>
+      <w:hyperlink w:history="1" r:id="rIdjmgz_1opdrqob3ouxvktx">
+        <w:r>
+          <w:rPr>
+            <w:rFonts w:ascii="DejaVu Serif" w:cs="DejaVu Serif" w:eastAsia="DejaVu Serif" w:hAnsi="DejaVu Serif"/>
+            <w:i w:val="false"/>
+            <w:iCs w:val="false"/>
+            <w:color w:val="0563C1"/>
+            <w:sz w:val="22"/>
+            <w:szCs w:val="22"/>
+            <w:u w:val="single"/>
+          </w:rPr>
+          <w:t xml:space="preserve">github.com/seratsaad/llm-in-astro-ph</w:t>
+        </w:r>
+      </w:hyperlink>
+      <w:r>
+        <w:rPr>
+          <w:rFonts w:ascii="DejaVu Serif" w:cs="DejaVu Serif" w:eastAsia="DejaVu Serif" w:hAnsi="DejaVu Serif"/>
+          <w:i w:val="false"/>
+          <w:iCs w:val="false"/>
+          <w:color w:val="1A1A1A"/>
+          <w:sz w:val="22"/>
+          <w:szCs w:val="22"/>
+        </w:rPr>
+        <w:t xml:space="preserve">, with instructions so anyone can repeat the counts or rebuild the figures. Some of the tools this work builds on, including the astro-ph knowledge graph, are shared by Yuan-Sen Ting at </w:t>
+      </w:r>
+      <w:hyperlink w:history="1" r:id="rIdinju13btrd8y2aonxuayl">
+        <w:r>
+          <w:rPr>
+            <w:rFonts w:ascii="DejaVu Serif" w:cs="DejaVu Serif" w:eastAsia="DejaVu Serif" w:hAnsi="DejaVu Serif"/>
+            <w:i w:val="false"/>
+            <w:iCs w:val="false"/>
+            <w:color w:val="0563C1"/>
+            <w:sz w:val="22"/>
+            <w:szCs w:val="22"/>
+            <w:u w:val="single"/>
+          </w:rPr>
+          <w:t xml:space="preserve">github.com/tingyuansen</w:t>
+        </w:r>
+      </w:hyperlink>
+      <w:r>
+        <w:rPr>
+          <w:rFonts w:ascii="DejaVu Serif" w:cs="DejaVu Serif" w:eastAsia="DejaVu Serif" w:hAnsi="DejaVu Serif"/>
+          <w:i w:val="false"/>
+          <w:iCs w:val="false"/>
+          <w:color w:val="1A1A1A"/>
+          <w:sz w:val="22"/>
+          <w:szCs w:val="22"/>
+        </w:rPr>
+        <w:t xml:space="preserve">. The words here are my own. It is harder than it sounds, which is part of the point.</w:t>
       </w:r>
     </w:p>
     <w:p>

</xml_diff>

<commit_message>
Add journal-style paper, n-gram + co-occurrence analysis, sober figure restyle
- paper/: aastex journal version, written in the pre-2022 register (linter PASS:
  0 Tier-A words, 0 phrase tells), compiles to 9 pages with bibliography.
- src/ngrams.py, plots_ngram.py: two-word phrase time series (n-gram viewer),
  data-driven bigram discovery, and marker-word co-occurrence lift (mean 14x,
  up to ~440x for some pairs) -- markers cluster within abstracts.
- Restyle figures toward publication quality: remove bold value labels and
  shaded era bands (thin ChatGPT reference line instead), thinner elements.
- Rebuild POST.docx/POST.pdf with the restyled figures.

Co-Authored-By: Claude Opus 4.8 <noreply@anthropic.com>
</commit_message>
<xml_diff>
--- a/POST.docx
+++ b/POST.docx
@@ -51,7 +51,7 @@
         </w:rPr>
         <w:t xml:space="preserve">Ask an early version of </w:t>
       </w:r>
-      <w:hyperlink w:history="1" r:id="rIdivdqovpcox6ozzyguyenz">
+      <w:hyperlink w:history="1" r:id="rIdt-iawcmcetjrj3v7fr6lh">
         <w:r>
           <w:rPr>
             <w:rFonts w:ascii="DejaVu Serif" w:cs="DejaVu Serif" w:eastAsia="DejaVu Serif" w:hAnsi="DejaVu Serif"/>
@@ -181,7 +181,7 @@
         </w:rPr>
         <w:t xml:space="preserve">Other fields have already put a number on this. </w:t>
       </w:r>
-      <w:hyperlink w:history="1" r:id="rId1hehov8mbceurv2sev9uq">
+      <w:hyperlink w:history="1" r:id="rIdcdjjwmvgpqkbbbnra3bxh">
         <w:r>
           <w:rPr>
             <w:rFonts w:ascii="DejaVu Serif" w:cs="DejaVu Serif" w:eastAsia="DejaVu Serif" w:hAnsi="DejaVu Serif"/>
@@ -206,7 +206,7 @@
         </w:rPr>
         <w:t xml:space="preserve"> estimates that a </w:t>
       </w:r>
-      <w:hyperlink w:history="1" r:id="rIdvxkwxlyb7hrmwwkdob4jj">
+      <w:hyperlink w:history="1" r:id="rIdvyui9py9lukyfrzixmbao">
         <w:r>
           <w:rPr>
             <w:rFonts w:ascii="DejaVu Serif" w:cs="DejaVu Serif" w:eastAsia="DejaVu Serif" w:hAnsi="DejaVu Serif"/>
@@ -231,7 +231,7 @@
         </w:rPr>
         <w:t xml:space="preserve"> (a text-prediction system trained on huge amounts of writing, ChatGPT being the best-known example) was involved in more than 10% of all papers published in 2024. In computer science the fraction of abstracts with model-edited text has been put </w:t>
       </w:r>
-      <w:hyperlink w:history="1" r:id="rIdceyylr-bf4mylfovby1gv">
+      <w:hyperlink w:history="1" r:id="rIdmhrd4_jtcl-muq7jybs5w">
         <w:r>
           <w:rPr>
             <w:rFonts w:ascii="DejaVu Serif" w:cs="DejaVu Serif" w:eastAsia="DejaVu Serif" w:hAnsi="DejaVu Serif"/>
@@ -256,7 +256,7 @@
         </w:rPr>
         <w:t xml:space="preserve">. For biomedical papers on </w:t>
       </w:r>
-      <w:hyperlink w:history="1" r:id="rIdjslvjsrfgerhxolakzekt">
+      <w:hyperlink w:history="1" r:id="rId53lmnds3vx0dvbec1m28c">
         <w:r>
           <w:rPr>
             <w:rFonts w:ascii="DejaVu Serif" w:cs="DejaVu Serif" w:eastAsia="DejaVu Serif" w:hAnsi="DejaVu Serif"/>
@@ -281,7 +281,7 @@
         </w:rPr>
         <w:t xml:space="preserve">, the estimate is at least </w:t>
       </w:r>
-      <w:hyperlink w:history="1" r:id="rIddzbmsscnesghkxjssltrs">
+      <w:hyperlink w:history="1" r:id="rIdn2kogh-df57heutmnwixh">
         <w:r>
           <w:rPr>
             <w:rFonts w:ascii="DejaVu Serif" w:cs="DejaVu Serif" w:eastAsia="DejaVu Serif" w:hAnsi="DejaVu Serif"/>
@@ -323,7 +323,7 @@
         </w:rPr>
         <w:t xml:space="preserve">I pulled the abstracts of every astro-ph paper posted to </w:t>
       </w:r>
-      <w:hyperlink w:history="1" r:id="rIduw9okjswo0vnnnqq9evc4">
+      <w:hyperlink w:history="1" r:id="rId8zyatig3re0mhb0quhdn-">
         <w:r>
           <w:rPr>
             <w:rFonts w:ascii="DejaVu Serif" w:cs="DejaVu Serif" w:eastAsia="DejaVu Serif" w:hAnsi="DejaVu Serif"/>
@@ -833,7 +833,7 @@
         </w:rPr>
         <w:t xml:space="preserve"> was known, it went away. Authors, and the tools themselves, stopped using it. But the top panel shows that the overall marker rate did not fall with it. Other words took over the load. </w:t>
       </w:r>
-      <w:hyperlink w:history="1" r:id="rIdxnlhdwv_ytd31tgzsx8fn">
+      <w:hyperlink w:history="1" r:id="rIdpnxcuess-3liso_oqbt0a">
         <w:r>
           <w:rPr>
             <w:rFonts w:ascii="DejaVu Serif" w:cs="DejaVu Serif" w:eastAsia="DejaVu Serif" w:hAnsi="DejaVu Serif"/>
@@ -954,7 +954,7 @@
         </w:rPr>
         <w:t xml:space="preserve">Figure 3: The words whose frequency rose the most in astro-ph, ranked by ratio. They split into two groups. Blue words are new telescopes and surveys (</w:t>
       </w:r>
-      <w:hyperlink w:history="1" r:id="rIdevar_iiws_5lf6cnkvj8h">
+      <w:hyperlink w:history="1" r:id="rIdl_ahmbvxsf1hx5ln_kpnt">
         <w:r>
           <w:rPr>
             <w:rFonts w:ascii="DejaVu Serif" w:cs="DejaVu Serif" w:eastAsia="DejaVu Serif" w:hAnsi="DejaVu Serif"/>
@@ -979,7 +979,7 @@
         </w:rPr>
         <w:t xml:space="preserve">'s NIRCam, MIRI, NIRSpec, the </w:t>
       </w:r>
-      <w:hyperlink w:history="1" r:id="rIdjzqchdwo_t8ukofn0eetl">
+      <w:hyperlink w:history="1" r:id="rId7e_1acypm2gt6rncd78d8">
         <w:r>
           <w:rPr>
             <w:rFonts w:ascii="DejaVu Serif" w:cs="DejaVu Serif" w:eastAsia="DejaVu Serif" w:hAnsi="DejaVu Serif"/>
@@ -1184,7 +1184,7 @@
         </w:rPr>
         <w:t xml:space="preserve">If a few percent of abstracts have chatbot help, how many authors mention it? </w:t>
       </w:r>
-      <w:hyperlink w:history="1" r:id="rIdticpfzlrlbrz63fb5daaa">
+      <w:hyperlink w:history="1" r:id="rIdi9p7n6plccdohyim0ynxf">
         <w:r>
           <w:rPr>
             <w:rFonts w:ascii="DejaVu Serif" w:cs="DejaVu Serif" w:eastAsia="DejaVu Serif" w:hAnsi="DejaVu Serif"/>
@@ -1209,7 +1209,7 @@
         </w:rPr>
         <w:t xml:space="preserve"> lets you search the acknowledgments section of papers, which is where people note the tools they used. I searched astronomy papers each year for clear terms: ChatGPT, GPT-4, "large language model", </w:t>
       </w:r>
-      <w:hyperlink w:history="1" r:id="rIdy88cxmsq_ci6yenrfnwfb">
+      <w:hyperlink w:history="1" r:id="rIdnvsrqxann0unaop8wayhz">
         <w:r>
           <w:rPr>
             <w:rFonts w:ascii="DejaVu Serif" w:cs="DejaVu Serif" w:eastAsia="DejaVu Serif" w:hAnsi="DejaVu Serif"/>
@@ -1234,7 +1234,7 @@
         </w:rPr>
         <w:t xml:space="preserve">. I left out words like "Gemini", which in astronomy usually means the </w:t>
       </w:r>
-      <w:hyperlink w:history="1" r:id="rIdcpup1iti2-ahhdwfdrres">
+      <w:hyperlink w:history="1" r:id="rIdqcikui0wfnd8bgs8nj84j">
         <w:r>
           <w:rPr>
             <w:rFonts w:ascii="DejaVu Serif" w:cs="DejaVu Serif" w:eastAsia="DejaVu Serif" w:hAnsi="DejaVu Serif"/>
@@ -1372,7 +1372,7 @@
         </w:rPr>
         <w:t xml:space="preserve">I tried one more thing. arXiv posts the </w:t>
       </w:r>
-      <w:hyperlink w:history="1" r:id="rIdr4_a6eys6-xbp-tp32qdf">
+      <w:hyperlink w:history="1" r:id="rIdnhilpzs0jccmyolimi_ha">
         <w:r>
           <w:rPr>
             <w:rFonts w:ascii="DejaVu Serif" w:cs="DejaVu Serif" w:eastAsia="DejaVu Serif" w:hAnsi="DejaVu Serif"/>
@@ -1527,7 +1527,7 @@
         </w:rPr>
         <w:t xml:space="preserve">There is a real worry in other fields that chatbots invent references, citations to papers that do not exist. </w:t>
       </w:r>
-      <w:hyperlink w:history="1" r:id="rIddc6wz3jt63gkfuqvmv9sl">
+      <w:hyperlink w:history="1" r:id="rIdncdxwnz6oy9qo_is0hsol">
         <w:r>
           <w:rPr>
             <w:rFonts w:ascii="DejaVu Serif" w:cs="DejaVu Serif" w:eastAsia="DejaVu Serif" w:hAnsi="DejaVu Serif"/>
@@ -1552,7 +1552,7 @@
         </w:rPr>
         <w:t xml:space="preserve"> found the rate of made-up citations rising, reaching roughly one paper in 458 by 2025. Astronomy has a tool that should guard against this: the </w:t>
       </w:r>
-      <w:hyperlink w:history="1" r:id="rId1u2dy8688absf-sxi6yw6">
+      <w:hyperlink w:history="1" r:id="rIdcwcx9ofe0doo-vww5kmhn">
         <w:r>
           <w:rPr>
             <w:rFonts w:ascii="DejaVu Serif" w:cs="DejaVu Serif" w:eastAsia="DejaVu Serif" w:hAnsi="DejaVu Serif"/>
@@ -1594,7 +1594,7 @@
         </w:rPr>
         <w:t xml:space="preserve">I checked. From the source of recent papers, I pulled about 6,460 cited arXiv identifiers and 2,500 cited </w:t>
       </w:r>
-      <w:hyperlink w:history="1" r:id="rIdrigxo0vwaguh0fuubt409">
+      <w:hyperlink w:history="1" r:id="rIdaa5rhjoxgcsb3n06x0sey">
         <w:r>
           <w:rPr>
             <w:rFonts w:ascii="DejaVu Serif" w:cs="DejaVu Serif" w:eastAsia="DejaVu Serif" w:hAnsi="DejaVu Serif"/>
@@ -1699,7 +1699,7 @@
         </w:rPr>
         <w:t xml:space="preserve">Every one of the 6,460 arXiv identifiers exists. Of the DOIs, the ones a first pass could not find turned out to be real records held in registries that the checking service does not index, such as arXiv's own system and the </w:t>
       </w:r>
-      <w:hyperlink w:history="1" r:id="rIdpgbad8w1ooj-azydnydsq">
+      <w:hyperlink w:history="1" r:id="rIdozdavad5nokhwmlu0r3hb">
         <w:r>
           <w:rPr>
             <w:rFonts w:ascii="DejaVu Serif" w:cs="DejaVu Serif" w:eastAsia="DejaVu Serif" w:hAnsi="DejaVu Serif"/>
@@ -2342,7 +2342,7 @@
         </w:rPr>
         <w:t xml:space="preserve">On policy, the picture is uneven. arXiv asks authors to </w:t>
       </w:r>
-      <w:hyperlink w:history="1" r:id="rIdug7vdylqe95ws3og6vefy">
+      <w:hyperlink w:history="1" r:id="rIdykmuvssbhvaply9l0lpu3">
         <w:r>
           <w:rPr>
             <w:rFonts w:ascii="DejaVu Serif" w:cs="DejaVu Serif" w:eastAsia="DejaVu Serif" w:hAnsi="DejaVu Serif"/>
@@ -2367,7 +2367,7 @@
         </w:rPr>
         <w:t xml:space="preserve"> and does not allow a tool to be listed as an author. Observatory time-allocation rules, such as those at </w:t>
       </w:r>
-      <w:hyperlink w:history="1" r:id="rIdhtdr-3tyrju8etyup9fgl">
+      <w:hyperlink w:history="1" r:id="rIdlkmj3npaw6-y5nbpnl8ii">
         <w:r>
           <w:rPr>
             <w:rFonts w:ascii="DejaVu Serif" w:cs="DejaVu Serif" w:eastAsia="DejaVu Serif" w:hAnsi="DejaVu Serif"/>
@@ -2392,7 +2392,7 @@
         </w:rPr>
         <w:t xml:space="preserve">, forbid using a chatbot to judge a proposal. Astronomy and Astrophysics put out a </w:t>
       </w:r>
-      <w:hyperlink w:history="1" r:id="rIdym4i6im_omsq9hhooqeu9">
+      <w:hyperlink w:history="1" r:id="rIdfnozklqkvghti79iadtfa">
         <w:r>
           <w:rPr>
             <w:rFonts w:ascii="DejaVu Serif" w:cs="DejaVu Serif" w:eastAsia="DejaVu Serif" w:hAnsi="DejaVu Serif"/>
@@ -2450,7 +2450,7 @@
         </w:rPr>
         <w:t xml:space="preserve">Given the subject, it is only fair to say how this post was made. I used Claude Code to gather the data, write the counting code, and draft the figures. I checked the numbers against the public arXiv and ADS records. The code and the derived data are on GitHub at </w:t>
       </w:r>
-      <w:hyperlink w:history="1" r:id="rIdjmgz_1opdrqob3ouxvktx">
+      <w:hyperlink w:history="1" r:id="rIdlis-xnznq2egpowvm-e3g">
         <w:r>
           <w:rPr>
             <w:rFonts w:ascii="DejaVu Serif" w:cs="DejaVu Serif" w:eastAsia="DejaVu Serif" w:hAnsi="DejaVu Serif"/>
@@ -2475,7 +2475,7 @@
         </w:rPr>
         <w:t xml:space="preserve">, with instructions so anyone can repeat the counts or rebuild the figures. Some of the tools this work builds on, including the astro-ph knowledge graph, are shared by Yuan-Sen Ting at </w:t>
       </w:r>
-      <w:hyperlink w:history="1" r:id="rIdinju13btrd8y2aonxuayl">
+      <w:hyperlink w:history="1" r:id="rIdwbozecz_hjqrpubz4kuia">
         <w:r>
           <w:rPr>
             <w:rFonts w:ascii="DejaVu Serif" w:cs="DejaVu Serif" w:eastAsia="DejaVu Serif" w:hAnsi="DejaVu Serif"/>

</xml_diff>

<commit_message>
Expand paper (equations, marker-word table, refereeing + feedback-loop discussion, robustness) and fix figure placement and legend overlaps
- Add estimator and co-occurrence lift equations; add Table 1 of marker-word ratios.
- Expand introduction (stakes, three modes of use) and discussion (implications for
  refereeing and disclosure norms; the training-corpus feedback loop).
- Fix floats with placeins + \FloatBarrier so figures sit near their text (12 pp).
- Fix legend-over-data overlaps in the n-gram viewer and detectability figures.
- Style linter still PASS (0 Tier-A, 0 phrase tells).

Co-Authored-By: Claude Opus 4.8 <noreply@anthropic.com>
</commit_message>
<xml_diff>
--- a/POST.docx
+++ b/POST.docx
@@ -51,7 +51,7 @@
         </w:rPr>
         <w:t xml:space="preserve">Ask an early version of </w:t>
       </w:r>
-      <w:hyperlink w:history="1" r:id="rIdt-iawcmcetjrj3v7fr6lh">
+      <w:hyperlink w:history="1" r:id="rId5d7zz5yxymf7vcgvty5yh">
         <w:r>
           <w:rPr>
             <w:rFonts w:ascii="DejaVu Serif" w:cs="DejaVu Serif" w:eastAsia="DejaVu Serif" w:hAnsi="DejaVu Serif"/>
@@ -181,7 +181,7 @@
         </w:rPr>
         <w:t xml:space="preserve">Other fields have already put a number on this. </w:t>
       </w:r>
-      <w:hyperlink w:history="1" r:id="rIdcdjjwmvgpqkbbbnra3bxh">
+      <w:hyperlink w:history="1" r:id="rIdcvwvnemkzr5pa7bioujfs">
         <w:r>
           <w:rPr>
             <w:rFonts w:ascii="DejaVu Serif" w:cs="DejaVu Serif" w:eastAsia="DejaVu Serif" w:hAnsi="DejaVu Serif"/>
@@ -206,7 +206,7 @@
         </w:rPr>
         <w:t xml:space="preserve"> estimates that a </w:t>
       </w:r>
-      <w:hyperlink w:history="1" r:id="rIdvyui9py9lukyfrzixmbao">
+      <w:hyperlink w:history="1" r:id="rIde-sfllcvqe8anvibjhjem">
         <w:r>
           <w:rPr>
             <w:rFonts w:ascii="DejaVu Serif" w:cs="DejaVu Serif" w:eastAsia="DejaVu Serif" w:hAnsi="DejaVu Serif"/>
@@ -231,7 +231,7 @@
         </w:rPr>
         <w:t xml:space="preserve"> (a text-prediction system trained on huge amounts of writing, ChatGPT being the best-known example) was involved in more than 10% of all papers published in 2024. In computer science the fraction of abstracts with model-edited text has been put </w:t>
       </w:r>
-      <w:hyperlink w:history="1" r:id="rIdmhrd4_jtcl-muq7jybs5w">
+      <w:hyperlink w:history="1" r:id="rIdv14bfnra2-i-35mtky2rg">
         <w:r>
           <w:rPr>
             <w:rFonts w:ascii="DejaVu Serif" w:cs="DejaVu Serif" w:eastAsia="DejaVu Serif" w:hAnsi="DejaVu Serif"/>
@@ -256,7 +256,7 @@
         </w:rPr>
         <w:t xml:space="preserve">. For biomedical papers on </w:t>
       </w:r>
-      <w:hyperlink w:history="1" r:id="rId53lmnds3vx0dvbec1m28c">
+      <w:hyperlink w:history="1" r:id="rId5wa0grxiv_7vszyreu7ez">
         <w:r>
           <w:rPr>
             <w:rFonts w:ascii="DejaVu Serif" w:cs="DejaVu Serif" w:eastAsia="DejaVu Serif" w:hAnsi="DejaVu Serif"/>
@@ -281,7 +281,7 @@
         </w:rPr>
         <w:t xml:space="preserve">, the estimate is at least </w:t>
       </w:r>
-      <w:hyperlink w:history="1" r:id="rIdn2kogh-df57heutmnwixh">
+      <w:hyperlink w:history="1" r:id="rIdr_bpynyx00ncxjdf0ogpb">
         <w:r>
           <w:rPr>
             <w:rFonts w:ascii="DejaVu Serif" w:cs="DejaVu Serif" w:eastAsia="DejaVu Serif" w:hAnsi="DejaVu Serif"/>
@@ -323,7 +323,7 @@
         </w:rPr>
         <w:t xml:space="preserve">I pulled the abstracts of every astro-ph paper posted to </w:t>
       </w:r>
-      <w:hyperlink w:history="1" r:id="rId8zyatig3re0mhb0quhdn-">
+      <w:hyperlink w:history="1" r:id="rIdsoobug-frz4maphjwb42b">
         <w:r>
           <w:rPr>
             <w:rFonts w:ascii="DejaVu Serif" w:cs="DejaVu Serif" w:eastAsia="DejaVu Serif" w:hAnsi="DejaVu Serif"/>
@@ -833,7 +833,7 @@
         </w:rPr>
         <w:t xml:space="preserve"> was known, it went away. Authors, and the tools themselves, stopped using it. But the top panel shows that the overall marker rate did not fall with it. Other words took over the load. </w:t>
       </w:r>
-      <w:hyperlink w:history="1" r:id="rIdpnxcuess-3liso_oqbt0a">
+      <w:hyperlink w:history="1" r:id="rIdpn1fadtqxixda9nculbp_">
         <w:r>
           <w:rPr>
             <w:rFonts w:ascii="DejaVu Serif" w:cs="DejaVu Serif" w:eastAsia="DejaVu Serif" w:hAnsi="DejaVu Serif"/>
@@ -954,7 +954,7 @@
         </w:rPr>
         <w:t xml:space="preserve">Figure 3: The words whose frequency rose the most in astro-ph, ranked by ratio. They split into two groups. Blue words are new telescopes and surveys (</w:t>
       </w:r>
-      <w:hyperlink w:history="1" r:id="rIdl_ahmbvxsf1hx5ln_kpnt">
+      <w:hyperlink w:history="1" r:id="rIdunip9gzq7xgekx6cpnsao">
         <w:r>
           <w:rPr>
             <w:rFonts w:ascii="DejaVu Serif" w:cs="DejaVu Serif" w:eastAsia="DejaVu Serif" w:hAnsi="DejaVu Serif"/>
@@ -979,7 +979,7 @@
         </w:rPr>
         <w:t xml:space="preserve">'s NIRCam, MIRI, NIRSpec, the </w:t>
       </w:r>
-      <w:hyperlink w:history="1" r:id="rId7e_1acypm2gt6rncd78d8">
+      <w:hyperlink w:history="1" r:id="rId918htsy8vqkmiltfhmz6x">
         <w:r>
           <w:rPr>
             <w:rFonts w:ascii="DejaVu Serif" w:cs="DejaVu Serif" w:eastAsia="DejaVu Serif" w:hAnsi="DejaVu Serif"/>
@@ -1184,7 +1184,7 @@
         </w:rPr>
         <w:t xml:space="preserve">If a few percent of abstracts have chatbot help, how many authors mention it? </w:t>
       </w:r>
-      <w:hyperlink w:history="1" r:id="rIdi9p7n6plccdohyim0ynxf">
+      <w:hyperlink w:history="1" r:id="rIdogh5v7wwa6g3ok_amd-qc">
         <w:r>
           <w:rPr>
             <w:rFonts w:ascii="DejaVu Serif" w:cs="DejaVu Serif" w:eastAsia="DejaVu Serif" w:hAnsi="DejaVu Serif"/>
@@ -1209,7 +1209,7 @@
         </w:rPr>
         <w:t xml:space="preserve"> lets you search the acknowledgments section of papers, which is where people note the tools they used. I searched astronomy papers each year for clear terms: ChatGPT, GPT-4, "large language model", </w:t>
       </w:r>
-      <w:hyperlink w:history="1" r:id="rIdnvsrqxann0unaop8wayhz">
+      <w:hyperlink w:history="1" r:id="rIdgk3vvqjo7heva6bqman5m">
         <w:r>
           <w:rPr>
             <w:rFonts w:ascii="DejaVu Serif" w:cs="DejaVu Serif" w:eastAsia="DejaVu Serif" w:hAnsi="DejaVu Serif"/>
@@ -1234,7 +1234,7 @@
         </w:rPr>
         <w:t xml:space="preserve">. I left out words like "Gemini", which in astronomy usually means the </w:t>
       </w:r>
-      <w:hyperlink w:history="1" r:id="rIdqcikui0wfnd8bgs8nj84j">
+      <w:hyperlink w:history="1" r:id="rIddwg4utuv8i_u5scf1kljt">
         <w:r>
           <w:rPr>
             <w:rFonts w:ascii="DejaVu Serif" w:cs="DejaVu Serif" w:eastAsia="DejaVu Serif" w:hAnsi="DejaVu Serif"/>
@@ -1372,7 +1372,7 @@
         </w:rPr>
         <w:t xml:space="preserve">I tried one more thing. arXiv posts the </w:t>
       </w:r>
-      <w:hyperlink w:history="1" r:id="rIdnhilpzs0jccmyolimi_ha">
+      <w:hyperlink w:history="1" r:id="rIdmkrrblrndknqb3abypcmt">
         <w:r>
           <w:rPr>
             <w:rFonts w:ascii="DejaVu Serif" w:cs="DejaVu Serif" w:eastAsia="DejaVu Serif" w:hAnsi="DejaVu Serif"/>
@@ -1527,7 +1527,7 @@
         </w:rPr>
         <w:t xml:space="preserve">There is a real worry in other fields that chatbots invent references, citations to papers that do not exist. </w:t>
       </w:r>
-      <w:hyperlink w:history="1" r:id="rIdncdxwnz6oy9qo_is0hsol">
+      <w:hyperlink w:history="1" r:id="rIdyhvhjnhxkidbsmklbp1r5">
         <w:r>
           <w:rPr>
             <w:rFonts w:ascii="DejaVu Serif" w:cs="DejaVu Serif" w:eastAsia="DejaVu Serif" w:hAnsi="DejaVu Serif"/>
@@ -1552,7 +1552,7 @@
         </w:rPr>
         <w:t xml:space="preserve"> found the rate of made-up citations rising, reaching roughly one paper in 458 by 2025. Astronomy has a tool that should guard against this: the </w:t>
       </w:r>
-      <w:hyperlink w:history="1" r:id="rIdcwcx9ofe0doo-vww5kmhn">
+      <w:hyperlink w:history="1" r:id="rIdcljonp7wvmzjhwn_vyhjs">
         <w:r>
           <w:rPr>
             <w:rFonts w:ascii="DejaVu Serif" w:cs="DejaVu Serif" w:eastAsia="DejaVu Serif" w:hAnsi="DejaVu Serif"/>
@@ -1594,7 +1594,7 @@
         </w:rPr>
         <w:t xml:space="preserve">I checked. From the source of recent papers, I pulled about 6,460 cited arXiv identifiers and 2,500 cited </w:t>
       </w:r>
-      <w:hyperlink w:history="1" r:id="rIdaa5rhjoxgcsb3n06x0sey">
+      <w:hyperlink w:history="1" r:id="rIdlfogp7ml465yrhtw2eaxr">
         <w:r>
           <w:rPr>
             <w:rFonts w:ascii="DejaVu Serif" w:cs="DejaVu Serif" w:eastAsia="DejaVu Serif" w:hAnsi="DejaVu Serif"/>
@@ -1699,7 +1699,7 @@
         </w:rPr>
         <w:t xml:space="preserve">Every one of the 6,460 arXiv identifiers exists. Of the DOIs, the ones a first pass could not find turned out to be real records held in registries that the checking service does not index, such as arXiv's own system and the </w:t>
       </w:r>
-      <w:hyperlink w:history="1" r:id="rIdozdavad5nokhwmlu0r3hb">
+      <w:hyperlink w:history="1" r:id="rIdouyxp57bltu8-xnvuhb7a">
         <w:r>
           <w:rPr>
             <w:rFonts w:ascii="DejaVu Serif" w:cs="DejaVu Serif" w:eastAsia="DejaVu Serif" w:hAnsi="DejaVu Serif"/>
@@ -2342,7 +2342,7 @@
         </w:rPr>
         <w:t xml:space="preserve">On policy, the picture is uneven. arXiv asks authors to </w:t>
       </w:r>
-      <w:hyperlink w:history="1" r:id="rIdykmuvssbhvaply9l0lpu3">
+      <w:hyperlink w:history="1" r:id="rIdd1vkdxz9xopjelewpqy7g">
         <w:r>
           <w:rPr>
             <w:rFonts w:ascii="DejaVu Serif" w:cs="DejaVu Serif" w:eastAsia="DejaVu Serif" w:hAnsi="DejaVu Serif"/>
@@ -2367,7 +2367,7 @@
         </w:rPr>
         <w:t xml:space="preserve"> and does not allow a tool to be listed as an author. Observatory time-allocation rules, such as those at </w:t>
       </w:r>
-      <w:hyperlink w:history="1" r:id="rIdlkmj3npaw6-y5nbpnl8ii">
+      <w:hyperlink w:history="1" r:id="rIdwkkhrhhiuw9tsqfhzhjyu">
         <w:r>
           <w:rPr>
             <w:rFonts w:ascii="DejaVu Serif" w:cs="DejaVu Serif" w:eastAsia="DejaVu Serif" w:hAnsi="DejaVu Serif"/>
@@ -2392,7 +2392,7 @@
         </w:rPr>
         <w:t xml:space="preserve">, forbid using a chatbot to judge a proposal. Astronomy and Astrophysics put out a </w:t>
       </w:r>
-      <w:hyperlink w:history="1" r:id="rIdfnozklqkvghti79iadtfa">
+      <w:hyperlink w:history="1" r:id="rId-86wm-r29rvjt7prvxeb9">
         <w:r>
           <w:rPr>
             <w:rFonts w:ascii="DejaVu Serif" w:cs="DejaVu Serif" w:eastAsia="DejaVu Serif" w:hAnsi="DejaVu Serif"/>
@@ -2450,7 +2450,7 @@
         </w:rPr>
         <w:t xml:space="preserve">Given the subject, it is only fair to say how this post was made. I used Claude Code to gather the data, write the counting code, and draft the figures. I checked the numbers against the public arXiv and ADS records. The code and the derived data are on GitHub at </w:t>
       </w:r>
-      <w:hyperlink w:history="1" r:id="rIdlis-xnznq2egpowvm-e3g">
+      <w:hyperlink w:history="1" r:id="rIdjzpmwpxyvcbodzj_bqz35">
         <w:r>
           <w:rPr>
             <w:rFonts w:ascii="DejaVu Serif" w:cs="DejaVu Serif" w:eastAsia="DejaVu Serif" w:hAnsi="DejaVu Serif"/>
@@ -2475,7 +2475,7 @@
         </w:rPr>
         <w:t xml:space="preserve">, with instructions so anyone can repeat the counts or rebuild the figures. Some of the tools this work builds on, including the astro-ph knowledge graph, are shared by Yuan-Sen Ting at </w:t>
       </w:r>
-      <w:hyperlink w:history="1" r:id="rIdwbozecz_hjqrpubz4kuia">
+      <w:hyperlink w:history="1" r:id="rId9pv-odhdekftwnujwsnrm">
         <w:r>
           <w:rPr>
             <w:rFonts w:ascii="DejaVu Serif" w:cs="DejaVu Serif" w:eastAsia="DejaVu Serif" w:hAnsi="DejaVu Serif"/>

</xml_diff>